<commit_message>
feat(intmap): add the interrupt map RTL, generated with the teacher's AI flow
m_qnsc_intmap, used exactly as the flow wrote it: 26 sources onto 11 Ibex
fast lines and the NMI, purely combinational, line indices and width from
qnsc_pkg, and a simulation-only X check per input.

Flow: nguyenquanicd/VLSIT_RTL_Generator_AI_Model, run from the org fork,
branch qsoc (/spec_parser, /config_ui, /rtl_generator; Gates 1 and 2
signed by the owner). Run record in the fork, Result/INTMAP_26_09_2026.

Engineer's part: MAS V2.3 with the decisions taken at Gate 1 (7.1 package
indices, 7.6 X check, open item 2 closed, check 11), README, tracker.
</commit_message>
<xml_diff>
--- a/doc/specs/docx/QNSC_Interrupt_Map_MAS.docx
+++ b/doc/specs/docx/QNSC_Interrupt_Map_MAS.docx
@@ -15,7 +15,7 @@
         <w:pStyle w:val="Subtitle"/>
       </w:pPr>
       <w:r>
-        <w:t xml:space="preserve">MICRO-ARCHITECTURE SPECIFICATION – V2.2</w:t>
+        <w:t xml:space="preserve">MICRO-ARCHITECTURE SPECIFICATION – V2.3</w:t>
       </w:r>
     </w:p>
     <w:p>
@@ -541,6 +541,83 @@
           </w:p>
         </w:tc>
       </w:tr>
+      <w:tr>
+        <w:tc>
+          <w:tcPr/>
+          <w:p>
+            <w:pPr>
+              <w:pStyle w:val="Compact"/>
+              <w:jc w:val="left"/>
+            </w:pPr>
+            <w:r>
+              <w:t xml:space="preserve">V2.3</w:t>
+            </w:r>
+          </w:p>
+        </w:tc>
+        <w:tc>
+          <w:tcPr/>
+          <w:p>
+            <w:pPr>
+              <w:pStyle w:val="Compact"/>
+              <w:jc w:val="left"/>
+            </w:pPr>
+            <w:r>
+              <w:t xml:space="preserve">2026-09-26</w:t>
+            </w:r>
+          </w:p>
+        </w:tc>
+        <w:tc>
+          <w:tcPr/>
+          <w:p>
+            <w:pPr>
+              <w:pStyle w:val="Compact"/>
+              <w:jc w:val="left"/>
+            </w:pPr>
+            <w:r>
+              <w:t xml:space="preserve">Nghia VT</w:t>
+            </w:r>
+          </w:p>
+        </w:tc>
+        <w:tc>
+          <w:tcPr/>
+          <w:p>
+            <w:pPr>
+              <w:pStyle w:val="Compact"/>
+              <w:jc w:val="left"/>
+            </w:pPr>
+            <w:r>
+              <w:t xml:space="preserve">–</w:t>
+            </w:r>
+          </w:p>
+        </w:tc>
+        <w:tc>
+          <w:tcPr/>
+          <w:p>
+            <w:pPr>
+              <w:pStyle w:val="Compact"/>
+              <w:jc w:val="left"/>
+            </w:pPr>
+            <w:r>
+              <w:t xml:space="preserve">Decisions from the RTL generation: line indices from</w:t>
+            </w:r>
+            <w:r>
+              <w:t xml:space="preserve"> </w:t>
+            </w:r>
+            <w:r>
+              <w:rPr>
+                <w:rStyle w:val="VerbatimChar"/>
+              </w:rPr>
+              <w:t xml:space="preserve">qnsc_pkg</w:t>
+            </w:r>
+            <w:r>
+              <w:t xml:space="preserve"> </w:t>
+            </w:r>
+            <w:r>
+              <w:t xml:space="preserve">(7.1); open item 2 closed by a simulation-only X check per input (7.6)</w:t>
+            </w:r>
+          </w:p>
+        </w:tc>
+      </w:tr>
     </w:tbl>
     <w:bookmarkEnd w:id="26"/>
     <w:bookmarkStart w:id="27" w:name="overview"/>
@@ -2133,7 +2210,7 @@
       </w:r>
     </w:p>
     <w:bookmarkEnd w:id="35"/>
-    <w:bookmarkStart w:id="41" w:name="functional-behaviour"/>
+    <w:bookmarkStart w:id="42" w:name="functional-behaviour"/>
     <w:p>
       <w:pPr>
         <w:pStyle w:val="Heading1"/>
@@ -2166,19 +2243,13 @@
         <w:rPr>
           <w:rStyle w:val="NormalTok"/>
         </w:rPr>
-        <w:t xml:space="preserve"> o_int_fast[</w:t>
+        <w:t xml:space="preserve"> o_int_fast[C_INT_LINE_DMA]        =  i_int_dma;          </w:t>
       </w:r>
       <w:r>
         <w:rPr>
-          <w:rStyle w:val="DecValTok"/>
+          <w:rStyle w:val="CommentTok"/>
         </w:rPr>
-        <w:t xml:space="preserve">0</w:t>
-      </w:r>
-      <w:r>
-        <w:rPr>
-          <w:rStyle w:val="NormalTok"/>
-        </w:rPr>
-        <w:t xml:space="preserve">]  =  i_int_dma;</w:t>
+        <w:t xml:space="preserve">// line 0</w:t>
       </w:r>
       <w:r>
         <w:br/>
@@ -2193,19 +2264,13 @@
         <w:rPr>
           <w:rStyle w:val="NormalTok"/>
         </w:rPr>
-        <w:t xml:space="preserve"> o_int_fast[</w:t>
+        <w:t xml:space="preserve"> o_int_fast[C_INT_LINE_SPI_DEVICE] = |i_int_spi_device;   </w:t>
       </w:r>
       <w:r>
         <w:rPr>
-          <w:rStyle w:val="DecValTok"/>
+          <w:rStyle w:val="CommentTok"/>
         </w:rPr>
-        <w:t xml:space="preserve">1</w:t>
-      </w:r>
-      <w:r>
-        <w:rPr>
-          <w:rStyle w:val="NormalTok"/>
-        </w:rPr>
-        <w:t xml:space="preserve">]  = |i_int_spi_device;</w:t>
+        <w:t xml:space="preserve">// line 1</w:t>
       </w:r>
       <w:r>
         <w:br/>
@@ -2220,19 +2285,13 @@
         <w:rPr>
           <w:rStyle w:val="NormalTok"/>
         </w:rPr>
-        <w:t xml:space="preserve"> o_int_fast[</w:t>
+        <w:t xml:space="preserve"> o_int_fast[C_INT_LINE_SPI_HOST]   = |i_int_spi_host;     </w:t>
       </w:r>
       <w:r>
         <w:rPr>
-          <w:rStyle w:val="DecValTok"/>
+          <w:rStyle w:val="CommentTok"/>
         </w:rPr>
-        <w:t xml:space="preserve">2</w:t>
-      </w:r>
-      <w:r>
-        <w:rPr>
-          <w:rStyle w:val="NormalTok"/>
-        </w:rPr>
-        <w:t xml:space="preserve">]  = |i_int_spi_host;</w:t>
+        <w:t xml:space="preserve">// line 2</w:t>
       </w:r>
       <w:r>
         <w:br/>
@@ -2247,19 +2306,13 @@
         <w:rPr>
           <w:rStyle w:val="NormalTok"/>
         </w:rPr>
-        <w:t xml:space="preserve"> o_int_fast[</w:t>
+        <w:t xml:space="preserve"> o_int_fast[C_INT_LINE_I2C]        =  i_int_i2c;          </w:t>
       </w:r>
       <w:r>
         <w:rPr>
-          <w:rStyle w:val="DecValTok"/>
+          <w:rStyle w:val="CommentTok"/>
         </w:rPr>
-        <w:t xml:space="preserve">3</w:t>
-      </w:r>
-      <w:r>
-        <w:rPr>
-          <w:rStyle w:val="NormalTok"/>
-        </w:rPr>
-        <w:t xml:space="preserve">]  =  i_int_i2c;</w:t>
+        <w:t xml:space="preserve">// line 3</w:t>
       </w:r>
       <w:r>
         <w:br/>
@@ -2274,19 +2327,13 @@
         <w:rPr>
           <w:rStyle w:val="NormalTok"/>
         </w:rPr>
-        <w:t xml:space="preserve"> o_int_fast[</w:t>
+        <w:t xml:space="preserve"> o_int_fast[C_INT_LINE_UART_0]     =  i_int_uart_0;       </w:t>
       </w:r>
       <w:r>
         <w:rPr>
-          <w:rStyle w:val="DecValTok"/>
+          <w:rStyle w:val="CommentTok"/>
         </w:rPr>
-        <w:t xml:space="preserve">4</w:t>
-      </w:r>
-      <w:r>
-        <w:rPr>
-          <w:rStyle w:val="NormalTok"/>
-        </w:rPr>
-        <w:t xml:space="preserve">]  =  i_int_uart_0;</w:t>
+        <w:t xml:space="preserve">// line 4</w:t>
       </w:r>
       <w:r>
         <w:br/>
@@ -2301,19 +2348,13 @@
         <w:rPr>
           <w:rStyle w:val="NormalTok"/>
         </w:rPr>
-        <w:t xml:space="preserve"> o_int_fast[</w:t>
+        <w:t xml:space="preserve"> o_int_fast[C_INT_LINE_UART_1]     =  i_int_uart_1;       </w:t>
       </w:r>
       <w:r>
         <w:rPr>
-          <w:rStyle w:val="DecValTok"/>
+          <w:rStyle w:val="CommentTok"/>
         </w:rPr>
-        <w:t xml:space="preserve">5</w:t>
-      </w:r>
-      <w:r>
-        <w:rPr>
-          <w:rStyle w:val="NormalTok"/>
-        </w:rPr>
-        <w:t xml:space="preserve">]  =  i_int_uart_1;</w:t>
+        <w:t xml:space="preserve">// line 5</w:t>
       </w:r>
       <w:r>
         <w:br/>
@@ -2328,19 +2369,13 @@
         <w:rPr>
           <w:rStyle w:val="NormalTok"/>
         </w:rPr>
-        <w:t xml:space="preserve"> o_int_fast[</w:t>
+        <w:t xml:space="preserve"> o_int_fast[C_INT_LINE_TIMER_1]    = |i_int_timer_1;      </w:t>
       </w:r>
       <w:r>
         <w:rPr>
-          <w:rStyle w:val="DecValTok"/>
+          <w:rStyle w:val="CommentTok"/>
         </w:rPr>
-        <w:t xml:space="preserve">6</w:t>
-      </w:r>
-      <w:r>
-        <w:rPr>
-          <w:rStyle w:val="NormalTok"/>
-        </w:rPr>
-        <w:t xml:space="preserve">]  = |i_int_timer_1;</w:t>
+        <w:t xml:space="preserve">// line 6</w:t>
       </w:r>
       <w:r>
         <w:br/>
@@ -2355,19 +2390,13 @@
         <w:rPr>
           <w:rStyle w:val="NormalTok"/>
         </w:rPr>
-        <w:t xml:space="preserve"> o_int_fast[</w:t>
+        <w:t xml:space="preserve"> o_int_fast[C_INT_LINE_PWM]        = |i_int_pwm;          </w:t>
       </w:r>
       <w:r>
         <w:rPr>
-          <w:rStyle w:val="DecValTok"/>
+          <w:rStyle w:val="CommentTok"/>
         </w:rPr>
-        <w:t xml:space="preserve">7</w:t>
-      </w:r>
-      <w:r>
-        <w:rPr>
-          <w:rStyle w:val="NormalTok"/>
-        </w:rPr>
-        <w:t xml:space="preserve">]  = |i_int_pwm;</w:t>
+        <w:t xml:space="preserve">// line 7</w:t>
       </w:r>
       <w:r>
         <w:br/>
@@ -2382,19 +2411,13 @@
         <w:rPr>
           <w:rStyle w:val="NormalTok"/>
         </w:rPr>
-        <w:t xml:space="preserve"> o_int_fast[</w:t>
+        <w:t xml:space="preserve"> o_int_fast[C_INT_LINE_WDT_WAKEUP] =  i_int_wdt_wakeup;   </w:t>
       </w:r>
       <w:r>
         <w:rPr>
-          <w:rStyle w:val="DecValTok"/>
+          <w:rStyle w:val="CommentTok"/>
         </w:rPr>
-        <w:t xml:space="preserve">8</w:t>
-      </w:r>
-      <w:r>
-        <w:rPr>
-          <w:rStyle w:val="NormalTok"/>
-        </w:rPr>
-        <w:t xml:space="preserve">]  =  i_int_wdt_wakeup;</w:t>
+        <w:t xml:space="preserve">// line 8</w:t>
       </w:r>
       <w:r>
         <w:br/>
@@ -2409,19 +2432,13 @@
         <w:rPr>
           <w:rStyle w:val="NormalTok"/>
         </w:rPr>
-        <w:t xml:space="preserve"> o_int_fast[</w:t>
+        <w:t xml:space="preserve"> o_int_fast[C_INT_LINE_GPIO]       = |i_int_gpio;         </w:t>
       </w:r>
       <w:r>
         <w:rPr>
-          <w:rStyle w:val="DecValTok"/>
+          <w:rStyle w:val="CommentTok"/>
         </w:rPr>
-        <w:t xml:space="preserve">9</w:t>
-      </w:r>
-      <w:r>
-        <w:rPr>
-          <w:rStyle w:val="NormalTok"/>
-        </w:rPr>
-        <w:t xml:space="preserve">]  = |i_int_gpio;</w:t>
+        <w:t xml:space="preserve">// line 9</w:t>
       </w:r>
       <w:r>
         <w:br/>
@@ -2436,19 +2453,13 @@
         <w:rPr>
           <w:rStyle w:val="NormalTok"/>
         </w:rPr>
-        <w:t xml:space="preserve"> o_int_fast[</w:t>
+        <w:t xml:space="preserve"> o_int_fast[C_INT_LINE_TIMER_0]    =  i_int_timer_0;      </w:t>
       </w:r>
       <w:r>
         <w:rPr>
-          <w:rStyle w:val="DecValTok"/>
+          <w:rStyle w:val="CommentTok"/>
         </w:rPr>
-        <w:t xml:space="preserve">10</w:t>
-      </w:r>
-      <w:r>
-        <w:rPr>
-          <w:rStyle w:val="NormalTok"/>
-        </w:rPr>
-        <w:t xml:space="preserve">] =  i_int_timer_0;</w:t>
+        <w:t xml:space="preserve">// line 10</w:t>
       </w:r>
       <w:r>
         <w:br/>
@@ -2463,7 +2474,7 @@
         <w:rPr>
           <w:rStyle w:val="NormalTok"/>
         </w:rPr>
-        <w:t xml:space="preserve"> o_int_nm       =  i_int_wdt_bark;</w:t>
+        <w:t xml:space="preserve"> o_int_nm                          =  i_int_wdt_bark;</w:t>
       </w:r>
     </w:p>
     <w:p>
@@ -2490,7 +2501,49 @@
         <w:t xml:space="preserve"> </w:t>
       </w:r>
       <w:r>
-        <w:t xml:space="preserve">output follows its inputs combinationally, with no cycle of delay.</w:t>
+        <w:t xml:space="preserve">output follows its inputs combinationally, with no cycle of delay. The line</w:t>
+      </w:r>
+      <w:r>
+        <w:t xml:space="preserve"> </w:t>
+      </w:r>
+      <w:r>
+        <w:t xml:space="preserve">indices and the width of</w:t>
+      </w:r>
+      <w:r>
+        <w:t xml:space="preserve"> </w:t>
+      </w:r>
+      <w:r>
+        <w:rPr>
+          <w:rStyle w:val="VerbatimChar"/>
+        </w:rPr>
+        <w:t xml:space="preserve">o_int_fast</w:t>
+      </w:r>
+      <w:r>
+        <w:t xml:space="preserve"> </w:t>
+      </w:r>
+      <w:r>
+        <w:t xml:space="preserve">(</w:t>
+      </w:r>
+      <w:r>
+        <w:rPr>
+          <w:rStyle w:val="VerbatimChar"/>
+        </w:rPr>
+        <w:t xml:space="preserve">C_INT_FAST_LINES_USED</w:t>
+      </w:r>
+      <w:r>
+        <w:t xml:space="preserve">) come from</w:t>
+      </w:r>
+      <w:r>
+        <w:t xml:space="preserve"> </w:t>
+      </w:r>
+      <w:r>
+        <w:rPr>
+          <w:rStyle w:val="VerbatimChar"/>
+        </w:rPr>
+        <w:t xml:space="preserve">qnsc_pkg</w:t>
+      </w:r>
+      <w:r>
+        <w:t xml:space="preserve">, so the line order has one source, the contract.</w:t>
       </w:r>
     </w:p>
     <w:bookmarkEnd w:id="36"/>
@@ -5440,8 +5493,74 @@
       </w:r>
     </w:p>
     <w:bookmarkEnd w:id="40"/>
+    <w:bookmarkStart w:id="41" w:name="Xbb525c329a409661eba23f8dc73df1b9f86944c"/>
+    <w:p>
+      <w:pPr>
+        <w:pStyle w:val="Heading2"/>
+      </w:pPr>
+      <w:r>
+        <w:t xml:space="preserve">7.6 An unknown input is reported in simulation</w:t>
+      </w:r>
+    </w:p>
+    <w:p>
+      <w:pPr>
+        <w:pStyle w:val="FirstParagraph"/>
+      </w:pPr>
+      <w:r>
+        <w:t xml:space="preserve">Inside</w:t>
+      </w:r>
+      <w:r>
+        <w:t xml:space="preserve"> </w:t>
+      </w:r>
+      <w:r>
+        <w:rPr>
+          <w:rStyle w:val="VerbatimChar"/>
+        </w:rPr>
+        <w:t xml:space="preserve">`ifndef SYNTHESIS</w:t>
+      </w:r>
+      <w:r>
+        <w:t xml:space="preserve">, one deferred assertion per input (</w:t>
+      </w:r>
+      <w:r>
+        <w:rPr>
+          <w:rStyle w:val="VerbatimChar"/>
+        </w:rPr>
+        <w:t xml:space="preserve">assert final</w:t>
+      </w:r>
+      <w:r>
+        <w:t xml:space="preserve">)</w:t>
+      </w:r>
+      <w:r>
+        <w:t xml:space="preserve"> </w:t>
+      </w:r>
+      <w:r>
+        <w:t xml:space="preserve">checks that the input is 0 or 1 and names it when it is X or Z. It adds no hardware.</w:t>
+      </w:r>
+      <w:r>
+        <w:t xml:space="preserve"> </w:t>
+      </w:r>
+      <w:r>
+        <w:t xml:space="preserve">An X would otherwise pass an OR gate silently, and Ibex checks only the whole bundle</w:t>
+      </w:r>
+      <w:r>
+        <w:t xml:space="preserve"> </w:t>
+      </w:r>
+      <w:r>
+        <w:t xml:space="preserve">(</w:t>
+      </w:r>
+      <w:r>
+        <w:rPr>
+          <w:rStyle w:val="VerbatimChar"/>
+        </w:rPr>
+        <w:t xml:space="preserve">IbexIrqX</w:t>
+      </w:r>
+      <w:r>
+        <w:t xml:space="preserve">). A 4-state simulator is needed to see it; Verilator is 2-state.</w:t>
+      </w:r>
+    </w:p>
     <w:bookmarkEnd w:id="41"/>
-    <w:bookmarkStart w:id="42" w:name="instances"/>
+    <w:bookmarkEnd w:id="42"/>
+    <w:bookmarkStart w:id="43" w:name="instances"/>
     <w:p>
       <w:pPr>
         <w:pStyle w:val="Heading1"/>
@@ -5473,8 +5592,8 @@
         <w:t xml:space="preserve">and has no parameters.</w:t>
       </w:r>
     </w:p>
-    <w:bookmarkEnd w:id="42"/>
-    <w:bookmarkStart w:id="43" w:name="X31074a9102d88bba972e4f71edc3e97f3cd819b"/>
+    <w:bookmarkEnd w:id="43"/>
+    <w:bookmarkStart w:id="44" w:name="X31074a9102d88bba972e4f71edc3e97f3cd819b"/>
     <w:p>
       <w:pPr>
         <w:pStyle w:val="Heading1"/>
@@ -5734,8 +5853,8 @@
         </w:tc>
       </w:tr>
     </w:tbl>
-    <w:bookmarkEnd w:id="43"/>
-    <w:bookmarkStart w:id="44" w:name="every-interrupt-input-on-the-core"/>
+    <w:bookmarkEnd w:id="44"/>
+    <w:bookmarkStart w:id="45" w:name="every-interrupt-input-on-the-core"/>
     <w:p>
       <w:pPr>
         <w:pStyle w:val="Heading1"/>
@@ -6405,8 +6524,8 @@
         </w:tc>
       </w:tr>
     </w:tbl>
-    <w:bookmarkEnd w:id="44"/>
-    <w:bookmarkStart w:id="45" w:name="requirements-on-others-and-open-items"/>
+    <w:bookmarkEnd w:id="45"/>
+    <w:bookmarkStart w:id="46" w:name="requirements-on-others-and-open-items"/>
     <w:p>
       <w:pPr>
         <w:pStyle w:val="Heading1"/>
@@ -6864,6 +6983,7 @@
         <w:rPr>
           <w:b/>
           <w:bCs/>
+          <w:strike/>
         </w:rPr>
         <w:t xml:space="preserve">X on an input.</w:t>
       </w:r>
@@ -6871,56 +6991,11 @@
         <w:t xml:space="preserve"> </w:t>
       </w:r>
       <w:r>
-        <w:t xml:space="preserve">An X passes the OR;</w:t>
-      </w:r>
-      <w:r>
-        <w:t xml:space="preserve"> </w:t>
-      </w:r>
-      <w:r>
-        <w:rPr>
-          <w:rStyle w:val="VerbatimChar"/>
-        </w:rPr>
-        <w:t xml:space="preserve">ibex_top.sv</w:t>
-      </w:r>
-      <w:r>
-        <w:t xml:space="preserve"> </w:t>
-      </w:r>
-      <w:r>
-        <w:rPr>
-          <w:rStyle w:val="VerbatimChar"/>
-        </w:rPr>
-        <w:t xml:space="preserve">IbexIrqX</w:t>
-      </w:r>
-      <w:r>
-        <w:t xml:space="preserve"> </w:t>
-      </w:r>
-      <w:r>
-        <w:t xml:space="preserve">checks only the</w:t>
-      </w:r>
-      <w:r>
-        <w:t xml:space="preserve"> </w:t>
-      </w:r>
-      <w:r>
-        <w:t xml:space="preserve">bundle. Open: whether this block asserts each</w:t>
-      </w:r>
-      <w:r>
-        <w:t xml:space="preserve"> </w:t>
-      </w:r>
-      <w:r>
-        <w:rPr>
-          <w:rStyle w:val="VerbatimChar"/>
-        </w:rPr>
-        <w:t xml:space="preserve">i_int_*</w:t>
-      </w:r>
-      <w:r>
-        <w:t xml:space="preserve"> </w:t>
-      </w:r>
-      <w:r>
-        <w:t xml:space="preserve">known.</w:t>
+        <w:t xml:space="preserve">Closed in V2.3: a simulation-only check per input (7.6).</w:t>
       </w:r>
     </w:p>
-    <w:bookmarkEnd w:id="45"/>
-    <w:bookmarkStart w:id="46" w:name="verification"/>
+    <w:bookmarkEnd w:id="46"/>
+    <w:bookmarkStart w:id="47" w:name="verification"/>
     <w:p>
       <w:pPr>
         <w:pStyle w:val="Heading1"/>
@@ -6934,7 +7009,7 @@
         <w:pStyle w:val="FirstParagraph"/>
       </w:pPr>
       <w:r>
-        <w:t xml:space="preserve">Ten checks, none needing a bus model:</w:t>
+        <w:t xml:space="preserve">Eleven checks, none needing a bus model:</w:t>
       </w:r>
     </w:p>
     <w:p>
@@ -7218,8 +7293,21 @@
         <w:t xml:space="preserve">.</w:t>
       </w:r>
     </w:p>
-    <w:bookmarkEnd w:id="46"/>
-    <w:bookmarkStart w:id="47" w:name="appendix-a.-acronyms"/>
+    <w:p>
+      <w:pPr>
+        <w:pStyle w:val="Compact"/>
+        <w:numPr>
+          <w:ilvl w:val="0"/>
+          <w:numId w:val="1003"/>
+        </w:numPr>
+        <w:jc w:val="left"/>
+      </w:pPr>
+      <w:r>
+        <w:t xml:space="preserve">An X on any input raises that input’s 7.6 assertion (4-state simulator).</w:t>
+      </w:r>
+    </w:p>
+    <w:bookmarkEnd w:id="47"/>
+    <w:bookmarkStart w:id="48" w:name="appendix-a.-acronyms"/>
     <w:p>
       <w:pPr>
         <w:pStyle w:val="Heading1"/>
@@ -7629,8 +7717,8 @@
         </w:tc>
       </w:tr>
     </w:tbl>
-    <w:bookmarkEnd w:id="47"/>
-    <w:bookmarkStart w:id="48" w:name="appendix-b.-first-review"/>
+    <w:bookmarkEnd w:id="48"/>
+    <w:bookmarkStart w:id="49" w:name="appendix-b.-first-review"/>
     <w:p>
       <w:pPr>
         <w:pStyle w:val="Heading1"/>
@@ -7937,7 +8025,7 @@
         </w:tc>
       </w:tr>
     </w:tbl>
-    <w:bookmarkEnd w:id="48"/>
+    <w:bookmarkEnd w:id="49"/>
     <w:sectPr>
       <w:headerReference r:id="rId11" w:type="default"/>
       <w:footerReference r:id="rId12" w:type="even"/>
@@ -8176,7 +8264,7 @@
       <w:rPr>
         <w:szCs w:val="26"/>
       </w:rPr>
-      <w:t>V2.2</w:t>
+      <w:t>V2.3</w:t>
     </w:r>
     <w:r>
       <w:rPr>

</xml_diff>

<commit_message>
docs(intmap): v2.4, watchdog bark before bite; wdt not in the gated cluster
aon_timer times out twice: the bark drives the NMI through INTMAP, the bite
requests the chip reset from SCRC. Firmware must set WDOG_BARK_THOLD below
WDOG_BITE_THOLD, or the chip resets before the NMI handler runs.

Section 7.5 said every interrupt source is in the gated peri cluster. Since
</commit_message>
<xml_diff>
--- a/doc/specs/docx/QNSC_Interrupt_Map_MAS.docx
+++ b/doc/specs/docx/QNSC_Interrupt_Map_MAS.docx
@@ -15,7 +15,7 @@
         <w:pStyle w:val="Subtitle"/>
       </w:pPr>
       <w:r>
-        <w:t xml:space="preserve">MICRO-ARCHITECTURE SPECIFICATION – V2.3</w:t>
+        <w:t xml:space="preserve">MICRO-ARCHITECTURE SPECIFICATION – V2.4</w:t>
       </w:r>
     </w:p>
     <w:p>
@@ -618,6 +618,95 @@
           </w:p>
         </w:tc>
       </w:tr>
+      <w:tr>
+        <w:tc>
+          <w:tcPr/>
+          <w:p>
+            <w:pPr>
+              <w:pStyle w:val="Compact"/>
+              <w:jc w:val="left"/>
+            </w:pPr>
+            <w:r>
+              <w:t xml:space="preserve">V2.4</w:t>
+            </w:r>
+          </w:p>
+        </w:tc>
+        <w:tc>
+          <w:tcPr/>
+          <w:p>
+            <w:pPr>
+              <w:pStyle w:val="Compact"/>
+              <w:jc w:val="left"/>
+            </w:pPr>
+            <w:r>
+              <w:t xml:space="preserve">2026-09-28</w:t>
+            </w:r>
+          </w:p>
+        </w:tc>
+        <w:tc>
+          <w:tcPr/>
+          <w:p>
+            <w:pPr>
+              <w:pStyle w:val="Compact"/>
+              <w:jc w:val="left"/>
+            </w:pPr>
+            <w:r>
+              <w:t xml:space="preserve">Nghia VT</w:t>
+            </w:r>
+          </w:p>
+        </w:tc>
+        <w:tc>
+          <w:tcPr/>
+          <w:p>
+            <w:pPr>
+              <w:pStyle w:val="Compact"/>
+              <w:jc w:val="left"/>
+            </w:pPr>
+            <w:r>
+              <w:t xml:space="preserve">–</w:t>
+            </w:r>
+          </w:p>
+        </w:tc>
+        <w:tc>
+          <w:tcPr/>
+          <w:p>
+            <w:pPr>
+              <w:pStyle w:val="Compact"/>
+              <w:jc w:val="left"/>
+            </w:pPr>
+            <w:r>
+              <w:t xml:space="preserve">Watchdog rule added:</w:t>
+            </w:r>
+            <w:r>
+              <w:t xml:space="preserve"> </w:t>
+            </w:r>
+            <w:r>
+              <w:rPr>
+                <w:rStyle w:val="VerbatimChar"/>
+              </w:rPr>
+              <w:t xml:space="preserve">WDOG_BARK_THOLD</w:t>
+            </w:r>
+            <w:r>
+              <w:t xml:space="preserve"> </w:t>
+            </w:r>
+            <w:r>
+              <w:t xml:space="preserve">&lt;</w:t>
+            </w:r>
+            <w:r>
+              <w:t xml:space="preserve"> </w:t>
+            </w:r>
+            <w:r>
+              <w:rPr>
+                <w:rStyle w:val="VerbatimChar"/>
+              </w:rPr>
+              <w:t xml:space="preserve">WDOG_BITE_THOLD</w:t>
+            </w:r>
+            <w:r>
+              <w:t xml:space="preserve">, so the NMI runs before the chip reset; 7.5 excludes the WDT, which is never gated</w:t>
+            </w:r>
+          </w:p>
+        </w:tc>
+      </w:tr>
     </w:tbl>
     <w:bookmarkEnd w:id="26"/>
     <w:bookmarkStart w:id="27" w:name="overview"/>
@@ -5392,7 +5481,7 @@
         <w:pStyle w:val="FirstParagraph"/>
       </w:pPr>
       <w:r>
-        <w:t xml:space="preserve">All interrupt sources are in the</w:t>
+        <w:t xml:space="preserve">Every interrupt source except the WDT is in the</w:t>
       </w:r>
       <w:r>
         <w:t xml:space="preserve"> </w:t>
@@ -5422,13 +5511,7 @@
         <w:t xml:space="preserve"> </w:t>
       </w:r>
       <w:r>
-        <w:t xml:space="preserve">stops</w:t>
-      </w:r>
-      <w:r>
-        <w:t xml:space="preserve"> </w:t>
-      </w:r>
-      <w:r>
-        <w:t xml:space="preserve">through</w:t>
+        <w:t xml:space="preserve">stops through</w:t>
       </w:r>
       <w:r>
         <w:t xml:space="preserve"> </w:t>
@@ -5440,13 +5523,19 @@
         <w:t xml:space="preserve">CLK_EN</w:t>
       </w:r>
       <w:r>
-        <w:t xml:space="preserve">. A stopped clock retains flip-flop state, so a peripheral gated</w:t>
+        <w:t xml:space="preserve">; the WDT clock is never stopped. A stopped clock</w:t>
       </w:r>
       <w:r>
         <w:t xml:space="preserve"> </w:t>
       </w:r>
       <w:r>
-        <w:t xml:space="preserve">with its interrupt asserted keeps its line high, and this block passes it on.</w:t>
+        <w:t xml:space="preserve">retains flip-flop state, so a peripheral gated with its interrupt asserted keeps</w:t>
+      </w:r>
+      <w:r>
+        <w:t xml:space="preserve"> </w:t>
+      </w:r>
+      <w:r>
+        <w:t xml:space="preserve">its line high, and this block passes it on.</w:t>
       </w:r>
       <w:r>
         <w:t xml:space="preserve"> </w:t>
@@ -6773,6 +6862,74 @@
                 <w:rStyle w:val="VerbatimChar"/>
               </w:rPr>
               <w:t xml:space="preserve">mstatus.MIE</w:t>
+            </w:r>
+          </w:p>
+        </w:tc>
+      </w:tr>
+      <w:tr>
+        <w:tc>
+          <w:tcPr/>
+          <w:p>
+            <w:pPr>
+              <w:pStyle w:val="Compact"/>
+              <w:jc w:val="left"/>
+            </w:pPr>
+            <w:r>
+              <w:rPr>
+                <w:rStyle w:val="VerbatimChar"/>
+              </w:rPr>
+              <w:t xml:space="preserve">aon_timer</w:t>
+            </w:r>
+            <w:r>
+              <w:t xml:space="preserve"> </w:t>
+            </w:r>
+            <w:r>
+              <w:rPr>
+                <w:rStyle w:val="VerbatimChar"/>
+              </w:rPr>
+              <w:t xml:space="preserve">WDOG_BARK_THOLD</w:t>
+            </w:r>
+            <w:r>
+              <w:t xml:space="preserve"> </w:t>
+            </w:r>
+            <w:r>
+              <w:t xml:space="preserve">&lt;</w:t>
+            </w:r>
+            <w:r>
+              <w:t xml:space="preserve"> </w:t>
+            </w:r>
+            <w:r>
+              <w:rPr>
+                <w:rStyle w:val="VerbatimChar"/>
+              </w:rPr>
+              <w:t xml:space="preserve">WDOG_BITE_THOLD</w:t>
+            </w:r>
+            <w:r>
+              <w:t xml:space="preserve">: the bark (NMI, first timeout) must come before the bite (chip reset, second timeout)</w:t>
+            </w:r>
+          </w:p>
+        </w:tc>
+        <w:tc>
+          <w:tcPr/>
+          <w:p>
+            <w:pPr>
+              <w:pStyle w:val="Compact"/>
+              <w:jc w:val="left"/>
+            </w:pPr>
+            <w:r>
+              <w:t xml:space="preserve">firmware owner</w:t>
+            </w:r>
+          </w:p>
+        </w:tc>
+        <w:tc>
+          <w:tcPr/>
+          <w:p>
+            <w:pPr>
+              <w:pStyle w:val="Compact"/>
+              <w:jc w:val="left"/>
+            </w:pPr>
+            <w:r>
+              <w:t xml:space="preserve">the NMI handler running before the reset</w:t>
             </w:r>
           </w:p>
         </w:tc>
@@ -8264,7 +8421,7 @@
       <w:rPr>
         <w:szCs w:val="26"/>
       </w:rPr>
-      <w:t>V2.3</w:t>
+      <w:t>V2.4</w:t>
     </w:r>
     <w:r>
       <w:rPr>

</xml_diff>

<commit_message>
docs(intmap): the dma line is the idle level, no DMA_ISR
</commit_message>
<xml_diff>
--- a/doc/specs/docx/QNSC_Interrupt_Map_MAS.docx
+++ b/doc/specs/docx/QNSC_Interrupt_Map_MAS.docx
@@ -4990,19 +4990,19 @@
               <w:jc w:val="left"/>
             </w:pPr>
             <w:r>
-              <w:t xml:space="preserve">level</w:t>
-            </w:r>
-          </w:p>
-        </w:tc>
-        <w:tc>
-          <w:tcPr/>
-          <w:p>
-            <w:pPr>
-              <w:pStyle w:val="Compact"/>
-              <w:jc w:val="left"/>
-            </w:pPr>
-            <w:r>
-              <w:t xml:space="preserve">W1C</w:t>
+              <w:t xml:space="preserve">level, idle</w:t>
+            </w:r>
+          </w:p>
+        </w:tc>
+        <w:tc>
+          <w:tcPr/>
+          <w:p>
+            <w:pPr>
+              <w:pStyle w:val="Compact"/>
+              <w:jc w:val="left"/>
+            </w:pPr>
+            <w:r>
+              <w:t xml:space="preserve">nothing: the line is 1 while the DMA is idle; the handler checks</w:t>
             </w:r>
             <w:r>
               <w:t xml:space="preserve"> </w:t>
@@ -5011,7 +5011,25 @@
               <w:rPr>
                 <w:rStyle w:val="VerbatimChar"/>
               </w:rPr>
-              <w:t xml:space="preserve">DMA_ISR</w:t>
+              <w:t xml:space="preserve">DONE_ID</w:t>
+            </w:r>
+            <w:r>
+              <w:t xml:space="preserve"> </w:t>
+            </w:r>
+            <w:r>
+              <w:t xml:space="preserve">(</w:t>
+            </w:r>
+            <w:r>
+              <w:rPr>
+                <w:rStyle w:val="VerbatimChar"/>
+              </w:rPr>
+              <w:t xml:space="preserve">QNSC_DMA_MAS</w:t>
+            </w:r>
+            <w:r>
+              <w:t xml:space="preserve"> </w:t>
+            </w:r>
+            <w:r>
+              <w:t xml:space="preserve">7.4)</w:t>
             </w:r>
           </w:p>
         </w:tc>
@@ -8032,7 +8050,7 @@
               <w:jc w:val="left"/>
             </w:pPr>
             <w:r>
-              <w:t xml:space="preserve">Level, held by W1C</w:t>
+              <w:t xml:space="preserve">Level: 1 while the DMA is idle,</w:t>
             </w:r>
             <w:r>
               <w:t xml:space="preserve"> </w:t>
@@ -8041,13 +8059,13 @@
               <w:rPr>
                 <w:rStyle w:val="VerbatimChar"/>
               </w:rPr>
-              <w:t xml:space="preserve">DMA_ISR</w:t>
+              <w:t xml:space="preserve">QNSC_DMA_MAS</w:t>
             </w:r>
             <w:r>
               <w:t xml:space="preserve"> </w:t>
             </w:r>
             <w:r>
-              <w:t xml:space="preserve">(7.4)</w:t>
+              <w:t xml:space="preserve">7.4</w:t>
             </w:r>
           </w:p>
         </w:tc>

</xml_diff>

<commit_message>
docs(intmap): section 12 checks carry INTMAP_NNN ids
</commit_message>
<xml_diff>
--- a/doc/specs/docx/QNSC_Interrupt_Map_MAS.docx
+++ b/doc/specs/docx/QNSC_Interrupt_Map_MAS.docx
@@ -15,7 +15,7 @@
         <w:pStyle w:val="Subtitle"/>
       </w:pPr>
       <w:r>
-        <w:t xml:space="preserve">MICRO-ARCHITECTURE SPECIFICATION – V2.4</w:t>
+        <w:t xml:space="preserve">MICRO-ARCHITECTURE SPECIFICATION – V2.5</w:t>
       </w:r>
     </w:p>
     <w:p>
@@ -707,6 +707,77 @@
           </w:p>
         </w:tc>
       </w:tr>
+      <w:tr>
+        <w:tc>
+          <w:tcPr/>
+          <w:p>
+            <w:pPr>
+              <w:pStyle w:val="Compact"/>
+              <w:jc w:val="left"/>
+            </w:pPr>
+            <w:r>
+              <w:t xml:space="preserve">V2.5</w:t>
+            </w:r>
+          </w:p>
+        </w:tc>
+        <w:tc>
+          <w:tcPr/>
+          <w:p>
+            <w:pPr>
+              <w:pStyle w:val="Compact"/>
+              <w:jc w:val="left"/>
+            </w:pPr>
+            <w:r>
+              <w:t xml:space="preserve">2026-09-30</w:t>
+            </w:r>
+          </w:p>
+        </w:tc>
+        <w:tc>
+          <w:tcPr/>
+          <w:p>
+            <w:pPr>
+              <w:pStyle w:val="Compact"/>
+              <w:jc w:val="left"/>
+            </w:pPr>
+            <w:r>
+              <w:t xml:space="preserve">Nghia VT</w:t>
+            </w:r>
+          </w:p>
+        </w:tc>
+        <w:tc>
+          <w:tcPr/>
+          <w:p>
+            <w:pPr>
+              <w:pStyle w:val="Compact"/>
+              <w:jc w:val="left"/>
+            </w:pPr>
+            <w:r>
+              <w:t xml:space="preserve">–</w:t>
+            </w:r>
+          </w:p>
+        </w:tc>
+        <w:tc>
+          <w:tcPr/>
+          <w:p>
+            <w:pPr>
+              <w:pStyle w:val="Compact"/>
+              <w:jc w:val="left"/>
+            </w:pPr>
+            <w:r>
+              <w:t xml:space="preserve">Section 12: every check carries an ID (</w:t>
+            </w:r>
+            <w:r>
+              <w:rPr>
+                <w:rStyle w:val="VerbatimChar"/>
+              </w:rPr>
+              <w:t xml:space="preserve">INTMAP_NNN</w:t>
+            </w:r>
+            <w:r>
+              <w:t xml:space="preserve">), for traceability to tests. No change in behaviour</w:t>
+            </w:r>
+          </w:p>
+        </w:tc>
+      </w:tr>
     </w:tbl>
     <w:bookmarkEnd w:id="26"/>
     <w:bookmarkStart w:id="27" w:name="overview"/>
@@ -7197,6 +7268,15 @@
         <w:jc w:val="left"/>
       </w:pPr>
       <w:r>
+        <w:rPr>
+          <w:rStyle w:val="VerbatimChar"/>
+        </w:rPr>
+        <w:t xml:space="preserve">INTMAP_001</w:t>
+      </w:r>
+      <w:r>
+        <w:t xml:space="preserve"> </w:t>
+      </w:r>
+      <w:r>
         <w:t xml:space="preserve">Each single-source input raises exactly its own line.</w:t>
       </w:r>
     </w:p>
@@ -7210,6 +7290,15 @@
         <w:jc w:val="left"/>
       </w:pPr>
       <w:r>
+        <w:rPr>
+          <w:rStyle w:val="VerbatimChar"/>
+        </w:rPr>
+        <w:t xml:space="preserve">INTMAP_002</w:t>
+      </w:r>
+      <w:r>
+        <w:t xml:space="preserve"> </w:t>
+      </w:r>
+      <w:r>
         <w:t xml:space="preserve">Each OR group raises its line for every member, individually.</w:t>
       </w:r>
     </w:p>
@@ -7223,6 +7312,15 @@
         <w:jc w:val="left"/>
       </w:pPr>
       <w:r>
+        <w:rPr>
+          <w:rStyle w:val="VerbatimChar"/>
+        </w:rPr>
+        <w:t xml:space="preserve">INTMAP_003</w:t>
+      </w:r>
+      <w:r>
+        <w:t xml:space="preserve"> </w:t>
+      </w:r>
+      <w:r>
         <w:t xml:space="preserve">No input raises a line other than its own.</w:t>
       </w:r>
     </w:p>
@@ -7239,6 +7337,15 @@
         <w:rPr>
           <w:rStyle w:val="VerbatimChar"/>
         </w:rPr>
+        <w:t xml:space="preserve">INTMAP_004</w:t>
+      </w:r>
+      <w:r>
+        <w:t xml:space="preserve"> </w:t>
+      </w:r>
+      <w:r>
+        <w:rPr>
+          <w:rStyle w:val="VerbatimChar"/>
+        </w:rPr>
         <w:t xml:space="preserve">irq_fast_i[14:11]</w:t>
       </w:r>
       <w:r>
@@ -7303,6 +7410,15 @@
         <w:rPr>
           <w:rStyle w:val="VerbatimChar"/>
         </w:rPr>
+        <w:t xml:space="preserve">INTMAP_005</w:t>
+      </w:r>
+      <w:r>
+        <w:t xml:space="preserve"> </w:t>
+      </w:r>
+      <w:r>
+        <w:rPr>
+          <w:rStyle w:val="VerbatimChar"/>
+        </w:rPr>
         <w:t xml:space="preserve">i_int_wdt_bark</w:t>
       </w:r>
       <w:r>
@@ -7349,6 +7465,15 @@
         <w:jc w:val="left"/>
       </w:pPr>
       <w:r>
+        <w:rPr>
+          <w:rStyle w:val="VerbatimChar"/>
+        </w:rPr>
+        <w:t xml:space="preserve">INTMAP_006</w:t>
+      </w:r>
+      <w:r>
+        <w:t xml:space="preserve"> </w:t>
+      </w:r>
+      <w:r>
         <w:t xml:space="preserve">Simultaneous inputs raise each affected line once.</w:t>
       </w:r>
     </w:p>
@@ -7362,6 +7487,15 @@
         <w:jc w:val="left"/>
       </w:pPr>
       <w:r>
+        <w:rPr>
+          <w:rStyle w:val="VerbatimChar"/>
+        </w:rPr>
+        <w:t xml:space="preserve">INTMAP_007</w:t>
+      </w:r>
+      <w:r>
+        <w:t xml:space="preserve"> </w:t>
+      </w:r>
+      <w:r>
         <w:t xml:space="preserve">Output follows input combinationally, with no cycle of delay.</w:t>
       </w:r>
     </w:p>
@@ -7378,6 +7512,15 @@
         <w:rPr>
           <w:rStyle w:val="VerbatimChar"/>
         </w:rPr>
+        <w:t xml:space="preserve">INTMAP_008</w:t>
+      </w:r>
+      <w:r>
+        <w:t xml:space="preserve"> </w:t>
+      </w:r>
+      <w:r>
+        <w:rPr>
+          <w:rStyle w:val="VerbatimChar"/>
+        </w:rPr>
         <w:t xml:space="preserve">mcause</w:t>
       </w:r>
       <w:r>
@@ -7409,6 +7552,15 @@
         <w:jc w:val="left"/>
       </w:pPr>
       <w:r>
+        <w:rPr>
+          <w:rStyle w:val="VerbatimChar"/>
+        </w:rPr>
+        <w:t xml:space="preserve">INTMAP_009</w:t>
+      </w:r>
+      <w:r>
+        <w:t xml:space="preserve"> </w:t>
+      </w:r>
+      <w:r>
         <w:t xml:space="preserve">A held input keeps its line asserted for as long as it is held (7.5).</w:t>
       </w:r>
     </w:p>
@@ -7423,6 +7575,15 @@
       </w:pPr>
       <w:r>
         <w:rPr>
+          <w:rStyle w:val="VerbatimChar"/>
+        </w:rPr>
+        <w:t xml:space="preserve">INTMAP_010</w:t>
+      </w:r>
+      <w:r>
+        <w:t xml:space="preserve"> </w:t>
+      </w:r>
+      <w:r>
+        <w:rPr>
           <w:b/>
           <w:bCs/>
         </w:rPr>
@@ -7477,6 +7638,15 @@
         </w:numPr>
         <w:jc w:val="left"/>
       </w:pPr>
+      <w:r>
+        <w:rPr>
+          <w:rStyle w:val="VerbatimChar"/>
+        </w:rPr>
+        <w:t xml:space="preserve">INTMAP_011</w:t>
+      </w:r>
+      <w:r>
+        <w:t xml:space="preserve"> </w:t>
+      </w:r>
       <w:r>
         <w:t xml:space="preserve">An X on any input raises that input’s 7.6 assertion (4-state simulator).</w:t>
       </w:r>
@@ -8439,7 +8609,7 @@
       <w:rPr>
         <w:szCs w:val="26"/>
       </w:rPr>
-      <w:t>V2.4</w:t>
+      <w:t>V2.5</w:t>
     </w:r>
     <w:r>
       <w:rPr>

</xml_diff>